<commit_message>
Update TM9 debate topics to Training Effectiveness (Kim, Chang, & Bell, 2025)
Co-Authored-By: Claude Opus 4.6 (1M context) <noreply@anthropic.com>
</commit_message>
<xml_diff>
--- a/Team-Meeting-9.docx
+++ b/Team-Meeting-9.docx
@@ -17,7 +17,7 @@
         </w:r>
       </w:hyperlink>
     </w:p>
-    <w:bookmarkStart w:id="25" w:name="team-meeting-agenda---ninth-team-meeting"/>
+    <w:bookmarkStart w:id="26" w:name="team-meeting-agenda---ninth-team-meeting"/>
     <w:p>
       <w:pPr>
         <w:pStyle w:val="Heading1"/>
@@ -26,13 +26,13 @@
         <w:t xml:space="preserve">Team Meeting Agenda - Ninth Team Meeting</w:t>
       </w:r>
     </w:p>
-    <w:bookmarkStart w:id="12" w:name="Xabfacf1e070265062e382cd5e76e033cccf5a61"/>
+    <w:bookmarkStart w:id="12" w:name="training-effectiveness-debate"/>
     <w:p>
       <w:pPr>
         <w:pStyle w:val="Heading2"/>
       </w:pPr>
       <w:r>
-        <w:t xml:space="preserve">Chapter 9 Convince Your Partner: Talent, Careers, and Development</w:t>
+        <w:t xml:space="preserve">Training Effectiveness Debate</w:t>
       </w:r>
     </w:p>
     <w:p>
@@ -497,19 +497,7 @@
         <w:pStyle w:val="FirstParagraph"/>
       </w:pPr>
       <w:r>
-        <w:t xml:space="preserve">Engage in a</w:t>
-      </w:r>
-      <w:r>
-        <w:t xml:space="preserve"> </w:t>
-      </w:r>
-      <w:r>
-        <w:t xml:space="preserve">“Convince Your Partner”</w:t>
-      </w:r>
-      <w:r>
-        <w:t xml:space="preserve"> </w:t>
-      </w:r>
-      <w:r>
-        <w:t xml:space="preserve">activity on Talent, Careers, and Development topics. You will be paired with a partner and take turns persuading each other from either the employee or employer perspective. Every person speaks, and roles swap each round.</w:t>
+        <w:t xml:space="preserve">Engage in a structured debate on Training Effectiveness topics based on a recent meta-analysis (Kim, Chang, &amp; Bell, 2025). You will argue from either the employee or employer perspective to develop critical thinking skills about workplace training issues.</w:t>
       </w:r>
     </w:p>
     <w:p>
@@ -534,7 +522,7 @@
         <w:t xml:space="preserve"> </w:t>
       </w:r>
       <w:r>
-        <w:t xml:space="preserve">The Notetaker sits in the center with the laptop, and all other team members sit around the Notetaker. Only the Notetaker may use a laptop during the activity. The Notetaker will verbally announce the topic and instructions.</w:t>
+        <w:t xml:space="preserve">The Notetaker sits in the center with the laptop, and all other team members sit around the Notetaker. Only the Notetaker may use a laptop during the debate. The Notetaker will verbally announce the debate topic and instructions.</w:t>
       </w:r>
     </w:p>
     <w:bookmarkEnd w:id="13"/>
@@ -558,7 +546,7 @@
         <w:t xml:space="preserve"> </w:t>
       </w:r>
       <w:r>
-        <w:t xml:space="preserve">1. Facilitating the activity and ensuring all team members contribute</w:t>
+        <w:t xml:space="preserve">1. Facilitating the discussion and ensuring all team members contribute</w:t>
       </w:r>
       <w:r>
         <w:t xml:space="preserve"> </w:t>
@@ -570,7 +558,7 @@
         <w:t xml:space="preserve"> </w:t>
       </w:r>
       <w:r>
-        <w:t xml:space="preserve">3. Recording key persuasion points from each pair</w:t>
+        <w:t xml:space="preserve">3. Recording key points from the discussion</w:t>
       </w:r>
       <w:r>
         <w:t xml:space="preserve"> </w:t>
@@ -620,13 +608,13 @@
         <w:t xml:space="preserve">Meeting Agenda</w:t>
       </w:r>
     </w:p>
-    <w:bookmarkStart w:id="15" w:name="minute-pair-up-for-todays-activity"/>
+    <w:bookmarkStart w:id="15" w:name="minute-assign-roles-for-todays-debate"/>
     <w:p>
       <w:pPr>
         <w:pStyle w:val="Heading3"/>
       </w:pPr>
       <w:r>
-        <w:t xml:space="preserve">[1 minute] Pair Up for Today’s Activity</w:t>
+        <w:t xml:space="preserve">[1 minute] Assign Roles for Today’s Debate</w:t>
       </w:r>
     </w:p>
     <w:p>
@@ -634,36 +622,7 @@
         <w:pStyle w:val="FirstParagraph"/>
       </w:pPr>
       <w:r>
-        <w:t xml:space="preserve">Pair up with a partner. The Notetaker will assign each pair a starting role. In each pair, one person starts as the</w:t>
-      </w:r>
-      <w:r>
-        <w:t xml:space="preserve"> </w:t>
-      </w:r>
-      <w:r>
-        <w:rPr>
-          <w:b/>
-          <w:bCs/>
-        </w:rPr>
-        <w:t xml:space="preserve">Employee Advocate</w:t>
-      </w:r>
-      <w:r>
-        <w:t xml:space="preserve"> </w:t>
-      </w:r>
-      <w:r>
-        <w:t xml:space="preserve">and the other as the</w:t>
-      </w:r>
-      <w:r>
-        <w:t xml:space="preserve"> </w:t>
-      </w:r>
-      <w:r>
-        <w:rPr>
-          <w:b/>
-          <w:bCs/>
-        </w:rPr>
-        <w:t xml:space="preserve">Employer Advocate</w:t>
-      </w:r>
-      <w:r>
-        <w:t xml:space="preserve">. Roles will swap after each round.</w:t>
+        <w:t xml:space="preserve">Divide your team into Employee Advocates and Employer Advocates. The Notetaker will facilitate and record the debate.</w:t>
       </w:r>
     </w:p>
     <w:p>
@@ -681,7 +640,207 @@
         <w:t xml:space="preserve"> </w:t>
       </w:r>
       <w:r>
-        <w:t xml:space="preserve">If you had an odd number, the Notetaker pairs with the remaining member.</w:t>
+        <w:t xml:space="preserve">If you were on the Employee side last week, switch to the Employer side this week.</w:t>
+      </w:r>
+    </w:p>
+    <w:p>
+      <w:pPr>
+        <w:pStyle w:val="BlockText"/>
+      </w:pPr>
+      <w:r>
+        <w:rPr>
+          <w:b/>
+          <w:bCs/>
+        </w:rPr>
+        <w:t xml:space="preserve">Note:</w:t>
+      </w:r>
+      <w:r>
+        <w:t xml:space="preserve"> </w:t>
+      </w:r>
+      <w:r>
+        <w:t xml:space="preserve">If your team has</w:t>
+      </w:r>
+      <w:r>
+        <w:t xml:space="preserve"> </w:t>
+      </w:r>
+      <w:r>
+        <w:rPr>
+          <w:b/>
+          <w:bCs/>
+        </w:rPr>
+        <w:t xml:space="preserve">3 or more members</w:t>
+      </w:r>
+      <w:r>
+        <w:t xml:space="preserve"> </w:t>
+      </w:r>
+      <w:r>
+        <w:t xml:space="preserve">present, the Notetaker focuses only on facilitating and recording the debate. If only</w:t>
+      </w:r>
+      <w:r>
+        <w:t xml:space="preserve"> </w:t>
+      </w:r>
+      <w:r>
+        <w:rPr>
+          <w:b/>
+          <w:bCs/>
+        </w:rPr>
+        <w:t xml:space="preserve">2 members</w:t>
+      </w:r>
+      <w:r>
+        <w:t xml:space="preserve"> </w:t>
+      </w:r>
+      <w:r>
+        <w:t xml:space="preserve">are present, the Notetaker must also choose either the Employee or Employer side. In that case, write the Notetaker’s name in both the Notetaker row AND their chosen advocate row.</w:t>
+      </w:r>
+    </w:p>
+    <w:tbl>
+      <w:tblPr>
+        <w:tblW w:type="pct" w:w="5000"/>
+        <w:tblStyle w:val="Table"/>
+        <w:tblLook w:firstRow="1" w:lastRow="0" w:firstColumn="0" w:lastColumn="0" w:noHBand="0" w:noVBand="0" w:val="0020"/>
+        <w:tblBorders>
+          <w:top w:val="single" w:sz="4" w:space="0" w:color="000000"/>
+          <w:left w:val="single" w:sz="4" w:space="0" w:color="000000"/>
+          <w:bottom w:val="single" w:sz="4" w:space="0" w:color="000000"/>
+          <w:right w:val="single" w:sz="4" w:space="0" w:color="000000"/>
+          <w:insideH w:val="single" w:sz="4" w:space="0" w:color="000000"/>
+          <w:insideV w:val="single" w:sz="4" w:space="0" w:color="000000"/>
+        </w:tblBorders>
+      </w:tblPr>
+      <w:tblGrid>
+        <w:gridCol w:w="3960"/>
+        <w:gridCol w:w="3960"/>
+      </w:tblGrid>
+      <w:tr>
+        <w:trPr>
+          <w:tblHeader w:val="on"/>
+        </w:trPr>
+        <w:tc>
+          <w:tcPr/>
+          <w:p>
+            <w:pPr>
+              <w:pStyle w:val="Compact"/>
+            </w:pPr>
+            <w:r>
+              <w:t xml:space="preserve">Role</w:t>
+            </w:r>
+          </w:p>
+        </w:tc>
+        <w:tc>
+          <w:tcPr/>
+          <w:p>
+            <w:pPr>
+              <w:pStyle w:val="Compact"/>
+            </w:pPr>
+            <w:r>
+              <w:t xml:space="preserve">Name(s)</w:t>
+            </w:r>
+          </w:p>
+        </w:tc>
+      </w:tr>
+      <w:tr>
+        <w:tc>
+          <w:tcPr/>
+          <w:p>
+            <w:pPr>
+              <w:pStyle w:val="Compact"/>
+            </w:pPr>
+            <w:r>
+              <w:t xml:space="preserve">Employee Advocate(s)</w:t>
+            </w:r>
+          </w:p>
+        </w:tc>
+        <w:tc>
+          <w:tcPr/>
+          <w:p>
+            <w:pPr>
+              <w:pStyle w:val="Compact"/>
+            </w:pPr>
+          </w:p>
+        </w:tc>
+      </w:tr>
+      <w:tr>
+        <w:tc>
+          <w:tcPr/>
+          <w:p>
+            <w:pPr>
+              <w:pStyle w:val="Compact"/>
+            </w:pPr>
+            <w:r>
+              <w:t xml:space="preserve">Employer Advocate(s)</w:t>
+            </w:r>
+          </w:p>
+        </w:tc>
+        <w:tc>
+          <w:tcPr/>
+          <w:p>
+            <w:pPr>
+              <w:pStyle w:val="Compact"/>
+            </w:pPr>
+          </w:p>
+        </w:tc>
+      </w:tr>
+      <w:tr>
+        <w:tc>
+          <w:tcPr/>
+          <w:p>
+            <w:pPr>
+              <w:pStyle w:val="Compact"/>
+            </w:pPr>
+            <w:r>
+              <w:t xml:space="preserve">Notetaker</w:t>
+            </w:r>
+          </w:p>
+        </w:tc>
+        <w:tc>
+          <w:tcPr/>
+          <w:p>
+            <w:pPr>
+              <w:pStyle w:val="Compact"/>
+            </w:pPr>
+          </w:p>
+        </w:tc>
+      </w:tr>
+    </w:tbl>
+    <w:p>
+      <w:r>
+        <w:pict>
+          <v:rect style="width:0;height:1.5pt" o:hralign="center" o:hrstd="t" o:hr="t"/>
+        </w:pict>
+      </w:r>
+    </w:p>
+    <w:bookmarkEnd w:id="15"/>
+    <w:bookmarkStart w:id="16" w:name="minute-select-todays-debate-topics"/>
+    <w:p>
+      <w:pPr>
+        <w:pStyle w:val="Heading3"/>
+      </w:pPr>
+      <w:r>
+        <w:t xml:space="preserve">[1 minute] Select Today’s Debate Topics</w:t>
+      </w:r>
+    </w:p>
+    <w:p>
+      <w:pPr>
+        <w:pStyle w:val="FirstParagraph"/>
+      </w:pPr>
+      <w:r>
+        <w:t xml:space="preserve">Choose</w:t>
+      </w:r>
+      <w:r>
+        <w:t xml:space="preserve"> </w:t>
+      </w:r>
+      <w:r>
+        <w:rPr>
+          <w:b/>
+          <w:bCs/>
+        </w:rPr>
+        <w:t xml:space="preserve">3 topics</w:t>
+      </w:r>
+      <w:r>
+        <w:t xml:space="preserve"> </w:t>
+      </w:r>
+      <w:r>
+        <w:t xml:space="preserve">from the list below to debate today.</w:t>
       </w:r>
     </w:p>
     <w:tbl>
@@ -700,9 +859,10 @@
         </w:tblBorders>
       </w:tblPr>
       <w:tblGrid>
-        <w:gridCol w:w="698"/>
-        <w:gridCol w:w="3610"/>
-        <w:gridCol w:w="3610"/>
+        <w:gridCol w:w="402"/>
+        <w:gridCol w:w="1879"/>
+        <w:gridCol w:w="2818"/>
+        <w:gridCol w:w="2818"/>
       </w:tblGrid>
       <w:tr>
         <w:trPr>
@@ -715,194 +875,6 @@
               <w:pStyle w:val="Compact"/>
             </w:pPr>
             <w:r>
-              <w:t xml:space="preserve">Pair</w:t>
-            </w:r>
-          </w:p>
-        </w:tc>
-        <w:tc>
-          <w:tcPr/>
-          <w:p>
-            <w:pPr>
-              <w:pStyle w:val="Compact"/>
-            </w:pPr>
-            <w:r>
-              <w:t xml:space="preserve">Partner A (starts as Employee)</w:t>
-            </w:r>
-          </w:p>
-        </w:tc>
-        <w:tc>
-          <w:tcPr/>
-          <w:p>
-            <w:pPr>
-              <w:pStyle w:val="Compact"/>
-            </w:pPr>
-            <w:r>
-              <w:t xml:space="preserve">Partner B (starts as Employer)</w:t>
-            </w:r>
-          </w:p>
-        </w:tc>
-      </w:tr>
-      <w:tr>
-        <w:tc>
-          <w:tcPr/>
-          <w:p>
-            <w:pPr>
-              <w:pStyle w:val="Compact"/>
-            </w:pPr>
-            <w:r>
-              <w:t xml:space="preserve">Pair 1</w:t>
-            </w:r>
-          </w:p>
-        </w:tc>
-        <w:tc>
-          <w:tcPr/>
-          <w:p>
-            <w:pPr>
-              <w:pStyle w:val="Compact"/>
-            </w:pPr>
-          </w:p>
-        </w:tc>
-        <w:tc>
-          <w:tcPr/>
-          <w:p>
-            <w:pPr>
-              <w:pStyle w:val="Compact"/>
-            </w:pPr>
-          </w:p>
-        </w:tc>
-      </w:tr>
-      <w:tr>
-        <w:tc>
-          <w:tcPr/>
-          <w:p>
-            <w:pPr>
-              <w:pStyle w:val="Compact"/>
-            </w:pPr>
-            <w:r>
-              <w:t xml:space="preserve">Pair 2</w:t>
-            </w:r>
-          </w:p>
-        </w:tc>
-        <w:tc>
-          <w:tcPr/>
-          <w:p>
-            <w:pPr>
-              <w:pStyle w:val="Compact"/>
-            </w:pPr>
-          </w:p>
-        </w:tc>
-        <w:tc>
-          <w:tcPr/>
-          <w:p>
-            <w:pPr>
-              <w:pStyle w:val="Compact"/>
-            </w:pPr>
-          </w:p>
-        </w:tc>
-      </w:tr>
-      <w:tr>
-        <w:tc>
-          <w:tcPr/>
-          <w:p>
-            <w:pPr>
-              <w:pStyle w:val="Compact"/>
-            </w:pPr>
-            <w:r>
-              <w:t xml:space="preserve">Pair 3</w:t>
-            </w:r>
-          </w:p>
-        </w:tc>
-        <w:tc>
-          <w:tcPr/>
-          <w:p>
-            <w:pPr>
-              <w:pStyle w:val="Compact"/>
-            </w:pPr>
-          </w:p>
-        </w:tc>
-        <w:tc>
-          <w:tcPr/>
-          <w:p>
-            <w:pPr>
-              <w:pStyle w:val="Compact"/>
-            </w:pPr>
-          </w:p>
-        </w:tc>
-      </w:tr>
-    </w:tbl>
-    <w:p>
-      <w:r>
-        <w:pict>
-          <v:rect style="width:0;height:1.5pt" o:hralign="center" o:hrstd="t" o:hr="t"/>
-        </w:pict>
-      </w:r>
-    </w:p>
-    <w:bookmarkEnd w:id="15"/>
-    <w:bookmarkStart w:id="16" w:name="minute-select-todays-topics"/>
-    <w:p>
-      <w:pPr>
-        <w:pStyle w:val="Heading3"/>
-      </w:pPr>
-      <w:r>
-        <w:t xml:space="preserve">[1 minute] Select Today’s Topics</w:t>
-      </w:r>
-    </w:p>
-    <w:p>
-      <w:pPr>
-        <w:pStyle w:val="FirstParagraph"/>
-      </w:pPr>
-      <w:r>
-        <w:t xml:space="preserve">Choose</w:t>
-      </w:r>
-      <w:r>
-        <w:t xml:space="preserve"> </w:t>
-      </w:r>
-      <w:r>
-        <w:rPr>
-          <w:b/>
-          <w:bCs/>
-        </w:rPr>
-        <w:t xml:space="preserve">2 topics</w:t>
-      </w:r>
-      <w:r>
-        <w:t xml:space="preserve"> </w:t>
-      </w:r>
-      <w:r>
-        <w:t xml:space="preserve">from the list below for today’s activity.</w:t>
-      </w:r>
-    </w:p>
-    <w:tbl>
-      <w:tblPr>
-        <w:tblW w:type="pct" w:w="5000"/>
-        <w:tblStyle w:val="Table"/>
-        <w:tblLayout w:type="fixed"/>
-        <w:tblLook w:firstRow="1" w:lastRow="0" w:firstColumn="0" w:lastColumn="0" w:noHBand="0" w:noVBand="0" w:val="0020"/>
-        <w:tblBorders>
-          <w:top w:val="single" w:sz="4" w:space="0" w:color="000000"/>
-          <w:left w:val="single" w:sz="4" w:space="0" w:color="000000"/>
-          <w:bottom w:val="single" w:sz="4" w:space="0" w:color="000000"/>
-          <w:right w:val="single" w:sz="4" w:space="0" w:color="000000"/>
-          <w:insideH w:val="single" w:sz="4" w:space="0" w:color="000000"/>
-          <w:insideV w:val="single" w:sz="4" w:space="0" w:color="000000"/>
-        </w:tblBorders>
-      </w:tblPr>
-      <w:tblGrid>
-        <w:gridCol w:w="456"/>
-        <w:gridCol w:w="1066"/>
-        <w:gridCol w:w="3198"/>
-        <w:gridCol w:w="3198"/>
-      </w:tblGrid>
-      <w:tr>
-        <w:trPr>
-          <w:tblHeader w:val="on"/>
-        </w:trPr>
-        <w:tc>
-          <w:tcPr/>
-          <w:p>
-            <w:pPr>
-              <w:pStyle w:val="Compact"/>
-            </w:pPr>
-            <w:r>
               <w:t xml:space="preserve">#</w:t>
             </w:r>
           </w:p>
@@ -914,7 +886,7 @@
               <w:pStyle w:val="Compact"/>
             </w:pPr>
             <w:r>
-              <w:t xml:space="preserve">Topic</w:t>
+              <w:t xml:space="preserve">Debate Topic</w:t>
             </w:r>
           </w:p>
         </w:tc>
@@ -960,29 +932,29 @@
               <w:pStyle w:val="Compact"/>
             </w:pPr>
             <w:r>
-              <w:t xml:space="preserve">Should companies prioritize internal promotions or external hires for management?</w:t>
-            </w:r>
-          </w:p>
-        </w:tc>
-        <w:tc>
-          <w:tcPr/>
-          <w:p>
-            <w:pPr>
-              <w:pStyle w:val="Compact"/>
-            </w:pPr>
-            <w:r>
-              <w:t xml:space="preserve">Internal promotion rewards loyalty and utilizes institutional knowledge</w:t>
-            </w:r>
-          </w:p>
-        </w:tc>
-        <w:tc>
-          <w:tcPr/>
-          <w:p>
-            <w:pPr>
-              <w:pStyle w:val="Compact"/>
-            </w:pPr>
-            <w:r>
-              <w:t xml:space="preserve">External hires bring fresh perspectives and new skills</w:t>
+              <w:t xml:space="preserve">Should companies measure training success by employee experience (relevance, quality) rather than exposure metrics (hours, completion rates)?</w:t>
+            </w:r>
+          </w:p>
+        </w:tc>
+        <w:tc>
+          <w:tcPr/>
+          <w:p>
+            <w:pPr>
+              <w:pStyle w:val="Compact"/>
+            </w:pPr>
+            <w:r>
+              <w:t xml:space="preserve">Experience measures capture what truly matters - whether training actually helps me do my job better</w:t>
+            </w:r>
+          </w:p>
+        </w:tc>
+        <w:tc>
+          <w:tcPr/>
+          <w:p>
+            <w:pPr>
+              <w:pStyle w:val="Compact"/>
+            </w:pPr>
+            <w:r>
+              <w:t xml:space="preserve">Exposure metrics are objective, trackable, and necessary for accountability and compliance</w:t>
             </w:r>
           </w:p>
         </w:tc>
@@ -1006,29 +978,29 @@
               <w:pStyle w:val="Compact"/>
             </w:pPr>
             <w:r>
-              <w:t xml:space="preserve">Should employees have formal career development plans?</w:t>
-            </w:r>
-          </w:p>
-        </w:tc>
-        <w:tc>
-          <w:tcPr/>
-          <w:p>
-            <w:pPr>
-              <w:pStyle w:val="Compact"/>
-            </w:pPr>
-            <w:r>
-              <w:t xml:space="preserve">Formal plans show company commitment and provide clear growth paths</w:t>
-            </w:r>
-          </w:p>
-        </w:tc>
-        <w:tc>
-          <w:tcPr/>
-          <w:p>
-            <w:pPr>
-              <w:pStyle w:val="Compact"/>
-            </w:pPr>
-            <w:r>
-              <w:t xml:space="preserve">Formal plans may create unrealistic expectations and limit flexibility</w:t>
+              <w:t xml:space="preserve">Should companies invest more in generic transferable skills (leadership, communication) or firm-specific skills (internal systems, company procedures)?</w:t>
+            </w:r>
+          </w:p>
+        </w:tc>
+        <w:tc>
+          <w:tcPr/>
+          <w:p>
+            <w:pPr>
+              <w:pStyle w:val="Compact"/>
+            </w:pPr>
+            <w:r>
+              <w:t xml:space="preserve">Generic skills increase my career growth and make me adaptable across roles</w:t>
+            </w:r>
+          </w:p>
+        </w:tc>
+        <w:tc>
+          <w:tcPr/>
+          <w:p>
+            <w:pPr>
+              <w:pStyle w:val="Compact"/>
+            </w:pPr>
+            <w:r>
+              <w:t xml:space="preserve">Firm-specific skills create competitive advantage that competitors can’t replicate</w:t>
             </w:r>
           </w:p>
         </w:tc>
@@ -1052,29 +1024,29 @@
               <w:pStyle w:val="Compact"/>
             </w:pPr>
             <w:r>
-              <w:t xml:space="preserve">Should companies offer paid sabbaticals to long-term employees?</w:t>
-            </w:r>
-          </w:p>
-        </w:tc>
-        <w:tc>
-          <w:tcPr/>
-          <w:p>
-            <w:pPr>
-              <w:pStyle w:val="Compact"/>
-            </w:pPr>
-            <w:r>
-              <w:t xml:space="preserve">Sabbaticals prevent burnout and reward loyalty</w:t>
-            </w:r>
-          </w:p>
-        </w:tc>
-        <w:tc>
-          <w:tcPr/>
-          <w:p>
-            <w:pPr>
-              <w:pStyle w:val="Compact"/>
-            </w:pPr>
-            <w:r>
-              <w:t xml:space="preserve">Sabbaticals disrupt operations and may not provide business value</w:t>
+              <w:t xml:space="preserve">Should companies raise employee compensation after investing in significant training?</w:t>
+            </w:r>
+          </w:p>
+        </w:tc>
+        <w:tc>
+          <w:tcPr/>
+          <w:p>
+            <w:pPr>
+              <w:pStyle w:val="Compact"/>
+            </w:pPr>
+            <w:r>
+              <w:t xml:space="preserve">Training increases my market value - if you don’t pay me more, someone else will</w:t>
+            </w:r>
+          </w:p>
+        </w:tc>
+        <w:tc>
+          <w:tcPr/>
+          <w:p>
+            <w:pPr>
+              <w:pStyle w:val="Compact"/>
+            </w:pPr>
+            <w:r>
+              <w:t xml:space="preserve">Training itself is already a valuable benefit; automatic raises aren’t financially sustainable</w:t>
             </w:r>
           </w:p>
         </w:tc>
@@ -1098,29 +1070,29 @@
               <w:pStyle w:val="Compact"/>
             </w:pPr>
             <w:r>
-              <w:t xml:space="preserve">Should high performers receive significantly more development opportunities?</w:t>
-            </w:r>
-          </w:p>
-        </w:tc>
-        <w:tc>
-          <w:tcPr/>
-          <w:p>
-            <w:pPr>
-              <w:pStyle w:val="Compact"/>
-            </w:pPr>
-            <w:r>
-              <w:t xml:space="preserve">All employees deserve equal development opportunities</w:t>
-            </w:r>
-          </w:p>
-        </w:tc>
-        <w:tc>
-          <w:tcPr/>
-          <w:p>
-            <w:pPr>
-              <w:pStyle w:val="Compact"/>
-            </w:pPr>
-            <w:r>
-              <w:t xml:space="preserve">Investing more in high performers maximizes organizational returns</w:t>
+              <w:t xml:space="preserve">Should companies continue investing in training even when it doesn’t improve employee retention?</w:t>
+            </w:r>
+          </w:p>
+        </w:tc>
+        <w:tc>
+          <w:tcPr/>
+          <w:p>
+            <w:pPr>
+              <w:pStyle w:val="Compact"/>
+            </w:pPr>
+            <w:r>
+              <w:t xml:space="preserve">Training boosts my motivation and performance regardless of whether I stay or leave</w:t>
+            </w:r>
+          </w:p>
+        </w:tc>
+        <w:tc>
+          <w:tcPr/>
+          <w:p>
+            <w:pPr>
+              <w:pStyle w:val="Compact"/>
+            </w:pPr>
+            <w:r>
+              <w:t xml:space="preserve">If trained employees leave, the company loses its investment with no return</w:t>
             </w:r>
           </w:p>
         </w:tc>
@@ -1144,29 +1116,29 @@
               <w:pStyle w:val="Compact"/>
             </w:pPr>
             <w:r>
-              <w:t xml:space="preserve">Should companies support employees pursuing degrees unrelated to their job?</w:t>
-            </w:r>
-          </w:p>
-        </w:tc>
-        <w:tc>
-          <w:tcPr/>
-          <w:p>
-            <w:pPr>
-              <w:pStyle w:val="Compact"/>
-            </w:pPr>
-            <w:r>
-              <w:t xml:space="preserve">Education benefits employee growth regardless of direct job relevance</w:t>
-            </w:r>
-          </w:p>
-        </w:tc>
-        <w:tc>
-          <w:tcPr/>
-          <w:p>
-            <w:pPr>
-              <w:pStyle w:val="Compact"/>
-            </w:pPr>
-            <w:r>
-              <w:t xml:space="preserve">Company-funded education should align with business needs</w:t>
+              <w:t xml:space="preserve">Should management actively champion and participate in training programs, or let employees drive their own development?</w:t>
+            </w:r>
+          </w:p>
+        </w:tc>
+        <w:tc>
+          <w:tcPr/>
+          <w:p>
+            <w:pPr>
+              <w:pStyle w:val="Compact"/>
+            </w:pPr>
+            <w:r>
+              <w:t xml:space="preserve">When leaders champion training, it signals the company truly values my growth</w:t>
+            </w:r>
+          </w:p>
+        </w:tc>
+        <w:tc>
+          <w:tcPr/>
+          <w:p>
+            <w:pPr>
+              <w:pStyle w:val="Compact"/>
+            </w:pPr>
+            <w:r>
+              <w:t xml:space="preserve">Self-directed learning fosters ownership; forced top-down programs feel inauthentic</w:t>
             </w:r>
           </w:p>
         </w:tc>
@@ -1190,29 +1162,29 @@
               <w:pStyle w:val="Compact"/>
             </w:pPr>
             <w:r>
-              <w:t xml:space="preserve">Should mentoring be mandatory for all managers?</w:t>
-            </w:r>
-          </w:p>
-        </w:tc>
-        <w:tc>
-          <w:tcPr/>
-          <w:p>
-            <w:pPr>
-              <w:pStyle w:val="Compact"/>
-            </w:pPr>
-            <w:r>
-              <w:t xml:space="preserve">Mandatory mentoring ensures knowledge transfer and employee development</w:t>
-            </w:r>
-          </w:p>
-        </w:tc>
-        <w:tc>
-          <w:tcPr/>
-          <w:p>
-            <w:pPr>
-              <w:pStyle w:val="Compact"/>
-            </w:pPr>
-            <w:r>
-              <w:t xml:space="preserve">Forced mentoring may lack authenticity and effectiveness</w:t>
+              <w:t xml:space="preserve">Should younger companies prioritize training investment over other immediate business needs, knowing results take years?</w:t>
+            </w:r>
+          </w:p>
+        </w:tc>
+        <w:tc>
+          <w:tcPr/>
+          <w:p>
+            <w:pPr>
+              <w:pStyle w:val="Compact"/>
+            </w:pPr>
+            <w:r>
+              <w:t xml:space="preserve">Early training builds the foundation for long-term success; waiting means falling behind</w:t>
+            </w:r>
+          </w:p>
+        </w:tc>
+        <w:tc>
+          <w:tcPr/>
+          <w:p>
+            <w:pPr>
+              <w:pStyle w:val="Compact"/>
+            </w:pPr>
+            <w:r>
+              <w:t xml:space="preserve">Limited resources should go to survival first; training can wait until the company stabilizes</w:t>
             </w:r>
           </w:p>
         </w:tc>
@@ -1295,36 +1267,65 @@
               <w:pStyle w:val="Compact"/>
             </w:pPr>
             <w:r>
-              <w:t xml:space="preserve">Round 1</w:t>
-            </w:r>
-          </w:p>
-        </w:tc>
-        <w:tc>
-          <w:tcPr/>
-          <w:p>
-            <w:pPr>
-              <w:pStyle w:val="Compact"/>
-            </w:pPr>
-          </w:p>
-        </w:tc>
-        <w:tc>
-          <w:tcPr/>
-          <w:p>
-            <w:pPr>
-              <w:pStyle w:val="Compact"/>
-            </w:pPr>
-          </w:p>
-        </w:tc>
-      </w:tr>
-      <w:tr>
-        <w:tc>
-          <w:tcPr/>
-          <w:p>
-            <w:pPr>
-              <w:pStyle w:val="Compact"/>
-            </w:pPr>
-            <w:r>
-              <w:t xml:space="preserve">Round 2</w:t>
+              <w:t xml:space="preserve">1st</w:t>
+            </w:r>
+          </w:p>
+        </w:tc>
+        <w:tc>
+          <w:tcPr/>
+          <w:p>
+            <w:pPr>
+              <w:pStyle w:val="Compact"/>
+            </w:pPr>
+          </w:p>
+        </w:tc>
+        <w:tc>
+          <w:tcPr/>
+          <w:p>
+            <w:pPr>
+              <w:pStyle w:val="Compact"/>
+            </w:pPr>
+          </w:p>
+        </w:tc>
+      </w:tr>
+      <w:tr>
+        <w:tc>
+          <w:tcPr/>
+          <w:p>
+            <w:pPr>
+              <w:pStyle w:val="Compact"/>
+            </w:pPr>
+            <w:r>
+              <w:t xml:space="preserve">2nd</w:t>
+            </w:r>
+          </w:p>
+        </w:tc>
+        <w:tc>
+          <w:tcPr/>
+          <w:p>
+            <w:pPr>
+              <w:pStyle w:val="Compact"/>
+            </w:pPr>
+          </w:p>
+        </w:tc>
+        <w:tc>
+          <w:tcPr/>
+          <w:p>
+            <w:pPr>
+              <w:pStyle w:val="Compact"/>
+            </w:pPr>
+          </w:p>
+        </w:tc>
+      </w:tr>
+      <w:tr>
+        <w:tc>
+          <w:tcPr/>
+          <w:p>
+            <w:pPr>
+              <w:pStyle w:val="Compact"/>
+            </w:pPr>
+            <w:r>
+              <w:t xml:space="preserve">3rd</w:t>
             </w:r>
           </w:p>
         </w:tc>
@@ -1368,23 +1369,7 @@
         <w:pStyle w:val="FirstParagraph"/>
       </w:pPr>
       <w:r>
-        <w:t xml:space="preserve">Take out a piece of paper and brainstorm your arguments individually for 6 minutes. Think about arguments for</w:t>
-      </w:r>
-      <w:r>
-        <w:t xml:space="preserve"> </w:t>
-      </w:r>
-      <w:r>
-        <w:rPr>
-          <w:b/>
-          <w:bCs/>
-        </w:rPr>
-        <w:t xml:space="preserve">both</w:t>
-      </w:r>
-      <w:r>
-        <w:t xml:space="preserve"> </w:t>
-      </w:r>
-      <w:r>
-        <w:t xml:space="preserve">sides, since you will argue from each perspective.</w:t>
+        <w:t xml:space="preserve">Before the debate begins, take out a piece of paper and brainstorm your arguments individually for 6 minutes.</w:t>
       </w:r>
     </w:p>
     <w:p>
@@ -1414,13 +1399,13 @@
     </w:p>
     <w:bookmarkEnd w:id="17"/>
     <w:bookmarkEnd w:id="18"/>
-    <w:bookmarkStart w:id="24" w:name="X58495c7a2de5da5245f311f82bdaad745078221"/>
+    <w:bookmarkStart w:id="25" w:name="debate-rounds-18-minutes-total"/>
     <w:p>
       <w:pPr>
         <w:pStyle w:val="Heading2"/>
       </w:pPr>
       <w:r>
-        <w:t xml:space="preserve">Convince Your Partner Rounds [14 minutes total]</w:t>
+        <w:t xml:space="preserve">Debate Rounds [18 minutes total]</w:t>
       </w:r>
     </w:p>
     <w:p>
@@ -1428,97 +1413,7 @@
         <w:pStyle w:val="FirstParagraph"/>
       </w:pPr>
       <w:r>
-        <w:t xml:space="preserve">Each round follows this structure (7 min per round):</w:t>
-      </w:r>
-      <w:r>
-        <w:t xml:space="preserve"> </w:t>
-      </w:r>
-      <w:r>
-        <w:t xml:space="preserve">1.</w:t>
-      </w:r>
-      <w:r>
-        <w:t xml:space="preserve"> </w:t>
-      </w:r>
-      <w:r>
-        <w:rPr>
-          <w:b/>
-          <w:bCs/>
-        </w:rPr>
-        <w:t xml:space="preserve">Partner A persuades</w:t>
-      </w:r>
-      <w:r>
-        <w:t xml:space="preserve"> </w:t>
-      </w:r>
-      <w:r>
-        <w:t xml:space="preserve">Partner B (2 min)</w:t>
-      </w:r>
-      <w:r>
-        <w:t xml:space="preserve"> </w:t>
-      </w:r>
-      <w:r>
-        <w:t xml:space="preserve">2.</w:t>
-      </w:r>
-      <w:r>
-        <w:t xml:space="preserve"> </w:t>
-      </w:r>
-      <w:r>
-        <w:rPr>
-          <w:b/>
-          <w:bCs/>
-        </w:rPr>
-        <w:t xml:space="preserve">Partner B persuades</w:t>
-      </w:r>
-      <w:r>
-        <w:t xml:space="preserve"> </w:t>
-      </w:r>
-      <w:r>
-        <w:t xml:space="preserve">Partner A (2 min)</w:t>
-      </w:r>
-      <w:r>
-        <w:t xml:space="preserve"> </w:t>
-      </w:r>
-      <w:r>
-        <w:t xml:space="preserve">3.</w:t>
-      </w:r>
-      <w:r>
-        <w:t xml:space="preserve"> </w:t>
-      </w:r>
-      <w:r>
-        <w:rPr>
-          <w:b/>
-          <w:bCs/>
-        </w:rPr>
-        <w:t xml:space="preserve">Debrief</w:t>
-      </w:r>
-      <w:r>
-        <w:t xml:space="preserve"> </w:t>
-      </w:r>
-      <w:r>
-        <w:t xml:space="preserve">as a pair and share with the group (3 min)</w:t>
-      </w:r>
-    </w:p>
-    <w:p>
-      <w:pPr>
-        <w:pStyle w:val="BodyText"/>
-      </w:pPr>
-      <w:r>
-        <w:t xml:space="preserve">Roles swap</w:t>
-      </w:r>
-      <w:r>
-        <w:t xml:space="preserve"> </w:t>
-      </w:r>
-      <w:r>
-        <w:rPr>
-          <w:b/>
-          <w:bCs/>
-        </w:rPr>
-        <w:t xml:space="preserve">between</w:t>
-      </w:r>
-      <w:r>
-        <w:t xml:space="preserve"> </w:t>
-      </w:r>
-      <w:r>
-        <w:t xml:space="preserve">rounds, not within a round.</w:t>
+        <w:t xml:space="preserve">For each topic (6 min each), both sides present their arguments, rebut, and share key takeaways.</w:t>
       </w:r>
     </w:p>
     <w:p>
@@ -1528,21 +1423,499 @@
         </w:pict>
       </w:r>
     </w:p>
-    <w:bookmarkStart w:id="19" w:name="round-1-_______________"/>
+    <w:bookmarkStart w:id="19" w:name="topic-1-_______________"/>
     <w:p>
       <w:pPr>
         <w:pStyle w:val="Heading3"/>
       </w:pPr>
       <w:r>
-        <w:t xml:space="preserve">Round 1: _______________</w:t>
-      </w:r>
-    </w:p>
-    <w:p>
-      <w:pPr>
-        <w:pStyle w:val="FirstParagraph"/>
-      </w:pPr>
-      <w:r>
-        <w:t xml:space="preserve">Partner A = Employee Advocate, Partner B = Employer Advocate</w:t>
+        <w:t xml:space="preserve">Topic 1: _______________</w:t>
+      </w:r>
+    </w:p>
+    <w:tbl>
+      <w:tblPr>
+        <w:tblW w:type="pct" w:w="5000"/>
+        <w:tblStyle w:val="Table"/>
+        <w:tblLook w:firstRow="1" w:lastRow="0" w:firstColumn="0" w:lastColumn="0" w:noHBand="0" w:noVBand="0" w:val="0020"/>
+        <w:tblBorders>
+          <w:top w:val="single" w:sz="4" w:space="0" w:color="000000"/>
+          <w:left w:val="single" w:sz="4" w:space="0" w:color="000000"/>
+          <w:bottom w:val="single" w:sz="4" w:space="0" w:color="000000"/>
+          <w:right w:val="single" w:sz="4" w:space="0" w:color="000000"/>
+          <w:insideH w:val="single" w:sz="4" w:space="0" w:color="000000"/>
+          <w:insideV w:val="single" w:sz="4" w:space="0" w:color="000000"/>
+        </w:tblBorders>
+      </w:tblPr>
+      <w:tblGrid>
+        <w:gridCol w:w="2640"/>
+        <w:gridCol w:w="2640"/>
+        <w:gridCol w:w="2640"/>
+      </w:tblGrid>
+      <w:tr>
+        <w:trPr>
+          <w:tblHeader w:val="on"/>
+        </w:trPr>
+        <w:tc>
+          <w:tcPr/>
+          <w:p>
+            <w:pPr>
+              <w:pStyle w:val="Compact"/>
+            </w:pPr>
+            <w:r>
+              <w:t xml:space="preserve">Phase</w:t>
+            </w:r>
+          </w:p>
+        </w:tc>
+        <w:tc>
+          <w:tcPr/>
+          <w:p>
+            <w:pPr>
+              <w:pStyle w:val="Compact"/>
+            </w:pPr>
+            <w:r>
+              <w:t xml:space="preserve">Employee Side</w:t>
+            </w:r>
+          </w:p>
+        </w:tc>
+        <w:tc>
+          <w:tcPr/>
+          <w:p>
+            <w:pPr>
+              <w:pStyle w:val="Compact"/>
+            </w:pPr>
+            <w:r>
+              <w:t xml:space="preserve">Employer Side</w:t>
+            </w:r>
+          </w:p>
+        </w:tc>
+      </w:tr>
+      <w:tr>
+        <w:tc>
+          <w:tcPr/>
+          <w:p>
+            <w:pPr>
+              <w:pStyle w:val="Compact"/>
+            </w:pPr>
+            <w:r>
+              <w:t xml:space="preserve">Opening (1 min each)</w:t>
+            </w:r>
+          </w:p>
+        </w:tc>
+        <w:tc>
+          <w:tcPr/>
+          <w:p>
+            <w:pPr>
+              <w:pStyle w:val="Compact"/>
+            </w:pPr>
+          </w:p>
+        </w:tc>
+        <w:tc>
+          <w:tcPr/>
+          <w:p>
+            <w:pPr>
+              <w:pStyle w:val="Compact"/>
+            </w:pPr>
+          </w:p>
+        </w:tc>
+      </w:tr>
+      <w:tr>
+        <w:tc>
+          <w:tcPr/>
+          <w:p>
+            <w:pPr>
+              <w:pStyle w:val="Compact"/>
+            </w:pPr>
+            <w:r>
+              <w:t xml:space="preserve">Rebuttal (1 min each)</w:t>
+            </w:r>
+          </w:p>
+        </w:tc>
+        <w:tc>
+          <w:tcPr/>
+          <w:p>
+            <w:pPr>
+              <w:pStyle w:val="Compact"/>
+            </w:pPr>
+          </w:p>
+        </w:tc>
+        <w:tc>
+          <w:tcPr/>
+          <w:p>
+            <w:pPr>
+              <w:pStyle w:val="Compact"/>
+            </w:pPr>
+          </w:p>
+        </w:tc>
+      </w:tr>
+      <w:tr>
+        <w:tc>
+          <w:tcPr/>
+          <w:p>
+            <w:pPr>
+              <w:pStyle w:val="Compact"/>
+            </w:pPr>
+            <w:r>
+              <w:t xml:space="preserve">Key Takeaway</w:t>
+            </w:r>
+          </w:p>
+        </w:tc>
+        <w:tc>
+          <w:tcPr/>
+          <w:p>
+            <w:pPr>
+              <w:pStyle w:val="Compact"/>
+            </w:pPr>
+          </w:p>
+        </w:tc>
+        <w:tc>
+          <w:tcPr/>
+          <w:p>
+            <w:pPr>
+              <w:pStyle w:val="Compact"/>
+            </w:pPr>
+          </w:p>
+        </w:tc>
+      </w:tr>
+    </w:tbl>
+    <w:p>
+      <w:r>
+        <w:pict>
+          <v:rect style="width:0;height:1.5pt" o:hralign="center" o:hrstd="t" o:hr="t"/>
+        </w:pict>
+      </w:r>
+    </w:p>
+    <w:bookmarkEnd w:id="19"/>
+    <w:bookmarkStart w:id="20" w:name="topic-2-_______________"/>
+    <w:p>
+      <w:pPr>
+        <w:pStyle w:val="Heading3"/>
+      </w:pPr>
+      <w:r>
+        <w:t xml:space="preserve">Topic 2: _______________</w:t>
+      </w:r>
+    </w:p>
+    <w:tbl>
+      <w:tblPr>
+        <w:tblW w:type="pct" w:w="5000"/>
+        <w:tblStyle w:val="Table"/>
+        <w:tblLook w:firstRow="1" w:lastRow="0" w:firstColumn="0" w:lastColumn="0" w:noHBand="0" w:noVBand="0" w:val="0020"/>
+        <w:tblBorders>
+          <w:top w:val="single" w:sz="4" w:space="0" w:color="000000"/>
+          <w:left w:val="single" w:sz="4" w:space="0" w:color="000000"/>
+          <w:bottom w:val="single" w:sz="4" w:space="0" w:color="000000"/>
+          <w:right w:val="single" w:sz="4" w:space="0" w:color="000000"/>
+          <w:insideH w:val="single" w:sz="4" w:space="0" w:color="000000"/>
+          <w:insideV w:val="single" w:sz="4" w:space="0" w:color="000000"/>
+        </w:tblBorders>
+      </w:tblPr>
+      <w:tblGrid>
+        <w:gridCol w:w="2640"/>
+        <w:gridCol w:w="2640"/>
+        <w:gridCol w:w="2640"/>
+      </w:tblGrid>
+      <w:tr>
+        <w:trPr>
+          <w:tblHeader w:val="on"/>
+        </w:trPr>
+        <w:tc>
+          <w:tcPr/>
+          <w:p>
+            <w:pPr>
+              <w:pStyle w:val="Compact"/>
+            </w:pPr>
+            <w:r>
+              <w:t xml:space="preserve">Phase</w:t>
+            </w:r>
+          </w:p>
+        </w:tc>
+        <w:tc>
+          <w:tcPr/>
+          <w:p>
+            <w:pPr>
+              <w:pStyle w:val="Compact"/>
+            </w:pPr>
+            <w:r>
+              <w:t xml:space="preserve">Employee Side</w:t>
+            </w:r>
+          </w:p>
+        </w:tc>
+        <w:tc>
+          <w:tcPr/>
+          <w:p>
+            <w:pPr>
+              <w:pStyle w:val="Compact"/>
+            </w:pPr>
+            <w:r>
+              <w:t xml:space="preserve">Employer Side</w:t>
+            </w:r>
+          </w:p>
+        </w:tc>
+      </w:tr>
+      <w:tr>
+        <w:tc>
+          <w:tcPr/>
+          <w:p>
+            <w:pPr>
+              <w:pStyle w:val="Compact"/>
+            </w:pPr>
+            <w:r>
+              <w:t xml:space="preserve">Opening (1 min each)</w:t>
+            </w:r>
+          </w:p>
+        </w:tc>
+        <w:tc>
+          <w:tcPr/>
+          <w:p>
+            <w:pPr>
+              <w:pStyle w:val="Compact"/>
+            </w:pPr>
+          </w:p>
+        </w:tc>
+        <w:tc>
+          <w:tcPr/>
+          <w:p>
+            <w:pPr>
+              <w:pStyle w:val="Compact"/>
+            </w:pPr>
+          </w:p>
+        </w:tc>
+      </w:tr>
+      <w:tr>
+        <w:tc>
+          <w:tcPr/>
+          <w:p>
+            <w:pPr>
+              <w:pStyle w:val="Compact"/>
+            </w:pPr>
+            <w:r>
+              <w:t xml:space="preserve">Rebuttal (1 min each)</w:t>
+            </w:r>
+          </w:p>
+        </w:tc>
+        <w:tc>
+          <w:tcPr/>
+          <w:p>
+            <w:pPr>
+              <w:pStyle w:val="Compact"/>
+            </w:pPr>
+          </w:p>
+        </w:tc>
+        <w:tc>
+          <w:tcPr/>
+          <w:p>
+            <w:pPr>
+              <w:pStyle w:val="Compact"/>
+            </w:pPr>
+          </w:p>
+        </w:tc>
+      </w:tr>
+      <w:tr>
+        <w:tc>
+          <w:tcPr/>
+          <w:p>
+            <w:pPr>
+              <w:pStyle w:val="Compact"/>
+            </w:pPr>
+            <w:r>
+              <w:t xml:space="preserve">Key Takeaway</w:t>
+            </w:r>
+          </w:p>
+        </w:tc>
+        <w:tc>
+          <w:tcPr/>
+          <w:p>
+            <w:pPr>
+              <w:pStyle w:val="Compact"/>
+            </w:pPr>
+          </w:p>
+        </w:tc>
+        <w:tc>
+          <w:tcPr/>
+          <w:p>
+            <w:pPr>
+              <w:pStyle w:val="Compact"/>
+            </w:pPr>
+          </w:p>
+        </w:tc>
+      </w:tr>
+    </w:tbl>
+    <w:p>
+      <w:r>
+        <w:pict>
+          <v:rect style="width:0;height:1.5pt" o:hralign="center" o:hrstd="t" o:hr="t"/>
+        </w:pict>
+      </w:r>
+    </w:p>
+    <w:bookmarkEnd w:id="20"/>
+    <w:bookmarkStart w:id="21" w:name="topic-3-_______________"/>
+    <w:p>
+      <w:pPr>
+        <w:pStyle w:val="Heading3"/>
+      </w:pPr>
+      <w:r>
+        <w:t xml:space="preserve">Topic 3: _______________</w:t>
+      </w:r>
+    </w:p>
+    <w:tbl>
+      <w:tblPr>
+        <w:tblW w:type="pct" w:w="5000"/>
+        <w:tblStyle w:val="Table"/>
+        <w:tblLook w:firstRow="1" w:lastRow="0" w:firstColumn="0" w:lastColumn="0" w:noHBand="0" w:noVBand="0" w:val="0020"/>
+        <w:tblBorders>
+          <w:top w:val="single" w:sz="4" w:space="0" w:color="000000"/>
+          <w:left w:val="single" w:sz="4" w:space="0" w:color="000000"/>
+          <w:bottom w:val="single" w:sz="4" w:space="0" w:color="000000"/>
+          <w:right w:val="single" w:sz="4" w:space="0" w:color="000000"/>
+          <w:insideH w:val="single" w:sz="4" w:space="0" w:color="000000"/>
+          <w:insideV w:val="single" w:sz="4" w:space="0" w:color="000000"/>
+        </w:tblBorders>
+      </w:tblPr>
+      <w:tblGrid>
+        <w:gridCol w:w="2640"/>
+        <w:gridCol w:w="2640"/>
+        <w:gridCol w:w="2640"/>
+      </w:tblGrid>
+      <w:tr>
+        <w:trPr>
+          <w:tblHeader w:val="on"/>
+        </w:trPr>
+        <w:tc>
+          <w:tcPr/>
+          <w:p>
+            <w:pPr>
+              <w:pStyle w:val="Compact"/>
+            </w:pPr>
+            <w:r>
+              <w:t xml:space="preserve">Phase</w:t>
+            </w:r>
+          </w:p>
+        </w:tc>
+        <w:tc>
+          <w:tcPr/>
+          <w:p>
+            <w:pPr>
+              <w:pStyle w:val="Compact"/>
+            </w:pPr>
+            <w:r>
+              <w:t xml:space="preserve">Employee Side</w:t>
+            </w:r>
+          </w:p>
+        </w:tc>
+        <w:tc>
+          <w:tcPr/>
+          <w:p>
+            <w:pPr>
+              <w:pStyle w:val="Compact"/>
+            </w:pPr>
+            <w:r>
+              <w:t xml:space="preserve">Employer Side</w:t>
+            </w:r>
+          </w:p>
+        </w:tc>
+      </w:tr>
+      <w:tr>
+        <w:tc>
+          <w:tcPr/>
+          <w:p>
+            <w:pPr>
+              <w:pStyle w:val="Compact"/>
+            </w:pPr>
+            <w:r>
+              <w:t xml:space="preserve">Opening (1 min each)</w:t>
+            </w:r>
+          </w:p>
+        </w:tc>
+        <w:tc>
+          <w:tcPr/>
+          <w:p>
+            <w:pPr>
+              <w:pStyle w:val="Compact"/>
+            </w:pPr>
+          </w:p>
+        </w:tc>
+        <w:tc>
+          <w:tcPr/>
+          <w:p>
+            <w:pPr>
+              <w:pStyle w:val="Compact"/>
+            </w:pPr>
+          </w:p>
+        </w:tc>
+      </w:tr>
+      <w:tr>
+        <w:tc>
+          <w:tcPr/>
+          <w:p>
+            <w:pPr>
+              <w:pStyle w:val="Compact"/>
+            </w:pPr>
+            <w:r>
+              <w:t xml:space="preserve">Rebuttal (1 min each)</w:t>
+            </w:r>
+          </w:p>
+        </w:tc>
+        <w:tc>
+          <w:tcPr/>
+          <w:p>
+            <w:pPr>
+              <w:pStyle w:val="Compact"/>
+            </w:pPr>
+          </w:p>
+        </w:tc>
+        <w:tc>
+          <w:tcPr/>
+          <w:p>
+            <w:pPr>
+              <w:pStyle w:val="Compact"/>
+            </w:pPr>
+          </w:p>
+        </w:tc>
+      </w:tr>
+      <w:tr>
+        <w:tc>
+          <w:tcPr/>
+          <w:p>
+            <w:pPr>
+              <w:pStyle w:val="Compact"/>
+            </w:pPr>
+            <w:r>
+              <w:t xml:space="preserve">Key Takeaway</w:t>
+            </w:r>
+          </w:p>
+        </w:tc>
+        <w:tc>
+          <w:tcPr/>
+          <w:p>
+            <w:pPr>
+              <w:pStyle w:val="Compact"/>
+            </w:pPr>
+          </w:p>
+        </w:tc>
+        <w:tc>
+          <w:tcPr/>
+          <w:p>
+            <w:pPr>
+              <w:pStyle w:val="Compact"/>
+            </w:pPr>
+          </w:p>
+        </w:tc>
+      </w:tr>
+    </w:tbl>
+    <w:p>
+      <w:r>
+        <w:pict>
+          <v:rect style="width:0;height:1.5pt" o:hralign="center" o:hrstd="t" o:hr="t"/>
+        </w:pict>
+      </w:r>
+    </w:p>
+    <w:bookmarkEnd w:id="21"/>
+    <w:bookmarkStart w:id="22" w:name="minutes-final-reflection"/>
+    <w:p>
+      <w:pPr>
+        <w:pStyle w:val="Heading3"/>
+      </w:pPr>
+      <w:r>
+        <w:t xml:space="preserve">[2 minutes] Final Reflection</w:t>
       </w:r>
     </w:p>
     <w:tbl>
@@ -1574,71 +1947,111 @@
               <w:pStyle w:val="Compact"/>
             </w:pPr>
             <w:r>
-              <w:t xml:space="preserve">Phase</w:t>
-            </w:r>
-          </w:p>
-        </w:tc>
-        <w:tc>
-          <w:tcPr/>
-          <w:p>
-            <w:pPr>
-              <w:pStyle w:val="Compact"/>
-            </w:pPr>
-            <w:r>
-              <w:t xml:space="preserve">Details</w:t>
-            </w:r>
-          </w:p>
-        </w:tc>
-      </w:tr>
-      <w:tr>
-        <w:tc>
-          <w:tcPr/>
-          <w:p>
-            <w:pPr>
-              <w:pStyle w:val="Compact"/>
-            </w:pPr>
-            <w:r>
-              <w:t xml:space="preserve">Partner A persuades B (2 min)</w:t>
-            </w:r>
-          </w:p>
-        </w:tc>
-        <w:tc>
-          <w:tcPr/>
-          <w:p>
-            <w:pPr>
-              <w:pStyle w:val="Compact"/>
-            </w:pPr>
-            <w:r>
-              <w:t xml:space="preserve">Employee side argues to Employer</w:t>
-            </w:r>
-          </w:p>
-        </w:tc>
-      </w:tr>
-      <w:tr>
-        <w:tc>
-          <w:tcPr/>
-          <w:p>
-            <w:pPr>
-              <w:pStyle w:val="Compact"/>
-            </w:pPr>
-            <w:r>
-              <w:t xml:space="preserve">Partner B persuades A (2 min)</w:t>
-            </w:r>
-          </w:p>
-        </w:tc>
-        <w:tc>
-          <w:tcPr/>
-          <w:p>
-            <w:pPr>
-              <w:pStyle w:val="Compact"/>
-            </w:pPr>
-            <w:r>
-              <w:t xml:space="preserve">Employer side argues to Employee</w:t>
-            </w:r>
+              <w:t xml:space="preserve">Question</w:t>
+            </w:r>
+          </w:p>
+        </w:tc>
+        <w:tc>
+          <w:tcPr/>
+          <w:p>
+            <w:pPr>
+              <w:pStyle w:val="Compact"/>
+            </w:pPr>
+            <w:r>
+              <w:t xml:space="preserve">Notes</w:t>
+            </w:r>
+          </w:p>
+        </w:tc>
+      </w:tr>
+      <w:tr>
+        <w:tc>
+          <w:tcPr/>
+          <w:p>
+            <w:pPr>
+              <w:pStyle w:val="Compact"/>
+            </w:pPr>
+            <w:r>
+              <w:t xml:space="preserve">Which topic was most debatable? Why?</w:t>
+            </w:r>
+          </w:p>
+        </w:tc>
+        <w:tc>
+          <w:tcPr/>
+          <w:p>
+            <w:pPr>
+              <w:pStyle w:val="Compact"/>
+            </w:pPr>
+          </w:p>
+        </w:tc>
+      </w:tr>
+      <w:tr>
+        <w:tc>
+          <w:tcPr/>
+          <w:p>
+            <w:pPr>
+              <w:pStyle w:val="Compact"/>
+            </w:pPr>
+            <w:r>
+              <w:t xml:space="preserve">What did you learn from the opposing view?</w:t>
+            </w:r>
+          </w:p>
+        </w:tc>
+        <w:tc>
+          <w:tcPr/>
+          <w:p>
+            <w:pPr>
+              <w:pStyle w:val="Compact"/>
+            </w:pPr>
+          </w:p>
+        </w:tc>
+      </w:tr>
+      <w:tr>
+        <w:tc>
+          <w:tcPr/>
+          <w:p>
+            <w:pPr>
+              <w:pStyle w:val="Compact"/>
+            </w:pPr>
+            <w:r>
+              <w:t xml:space="preserve">Any common ground found across topics?</w:t>
+            </w:r>
+          </w:p>
+        </w:tc>
+        <w:tc>
+          <w:tcPr/>
+          <w:p>
+            <w:pPr>
+              <w:pStyle w:val="Compact"/>
+            </w:pPr>
           </w:p>
         </w:tc>
       </w:tr>
     </w:tbl>
+    <w:p>
+      <w:r>
+        <w:pict>
+          <v:rect style="width:0;height:1.5pt" o:hralign="center" o:hrstd="t" o:hr="t"/>
+        </w:pict>
+      </w:r>
+    </w:p>
+    <w:bookmarkEnd w:id="22"/>
+    <w:bookmarkStart w:id="23" w:name="minute-wrap-up"/>
+    <w:p>
+      <w:pPr>
+        <w:pStyle w:val="Heading3"/>
+      </w:pPr>
+      <w:r>
+        <w:t xml:space="preserve">[1 minute] Wrap-up</w:t>
+      </w:r>
+    </w:p>
+    <w:p>
+      <w:pPr>
+        <w:pStyle w:val="FirstParagraph"/>
+      </w:pPr>
+      <w:r>
+        <w:t xml:space="preserve">Check the syllabus to find out when the next team meeting will be. Discuss who will be the next Notetaker.</w:t>
+      </w:r>
+    </w:p>
     <w:p>
       <w:pPr>
         <w:pStyle w:val="BodyText"/>
@@ -1648,13 +2061,7 @@
           <w:b/>
           <w:bCs/>
         </w:rPr>
-        <w:t xml:space="preserve">Debrief (3 min):</w:t>
-      </w:r>
-      <w:r>
-        <w:t xml:space="preserve"> </w:t>
-      </w:r>
-      <w:r>
-        <w:t xml:space="preserve">Each pair shares with the group.</w:t>
+        <w:t xml:space="preserve">Our next meeting:</w:t>
       </w:r>
     </w:p>
     <w:tbl>
@@ -1686,73 +2093,94 @@
               <w:pStyle w:val="Compact"/>
             </w:pPr>
             <w:r>
-              <w:t xml:space="preserve">Pair</w:t>
-            </w:r>
-          </w:p>
-        </w:tc>
-        <w:tc>
-          <w:tcPr/>
-          <w:p>
-            <w:pPr>
-              <w:pStyle w:val="Compact"/>
-            </w:pPr>
-            <w:r>
-              <w:t xml:space="preserve">What was the most convincing argument?</w:t>
-            </w:r>
-          </w:p>
-        </w:tc>
-      </w:tr>
-      <w:tr>
-        <w:tc>
-          <w:tcPr/>
-          <w:p>
-            <w:pPr>
-              <w:pStyle w:val="Compact"/>
-            </w:pPr>
-            <w:r>
-              <w:t xml:space="preserve">Pair 1</w:t>
-            </w:r>
-          </w:p>
-        </w:tc>
-        <w:tc>
-          <w:tcPr/>
-          <w:p>
-            <w:pPr>
-              <w:pStyle w:val="Compact"/>
-            </w:pPr>
-          </w:p>
-        </w:tc>
-      </w:tr>
-      <w:tr>
-        <w:tc>
-          <w:tcPr/>
-          <w:p>
-            <w:pPr>
-              <w:pStyle w:val="Compact"/>
-            </w:pPr>
-            <w:r>
-              <w:t xml:space="preserve">Pair 2</w:t>
-            </w:r>
-          </w:p>
-        </w:tc>
-        <w:tc>
-          <w:tcPr/>
-          <w:p>
-            <w:pPr>
-              <w:pStyle w:val="Compact"/>
-            </w:pPr>
-          </w:p>
-        </w:tc>
-      </w:tr>
-      <w:tr>
-        <w:tc>
-          <w:tcPr/>
-          <w:p>
-            <w:pPr>
-              <w:pStyle w:val="Compact"/>
-            </w:pPr>
-            <w:r>
-              <w:t xml:space="preserve">Pair 3</w:t>
+              <w:t xml:space="preserve">Item</w:t>
+            </w:r>
+          </w:p>
+        </w:tc>
+        <w:tc>
+          <w:tcPr/>
+          <w:p>
+            <w:pPr>
+              <w:pStyle w:val="Compact"/>
+            </w:pPr>
+            <w:r>
+              <w:t xml:space="preserve">Details</w:t>
+            </w:r>
+          </w:p>
+        </w:tc>
+      </w:tr>
+      <w:tr>
+        <w:tc>
+          <w:tcPr/>
+          <w:p>
+            <w:pPr>
+              <w:pStyle w:val="Compact"/>
+            </w:pPr>
+            <w:r>
+              <w:t xml:space="preserve">Date</w:t>
+            </w:r>
+          </w:p>
+        </w:tc>
+        <w:tc>
+          <w:tcPr/>
+          <w:p>
+            <w:pPr>
+              <w:pStyle w:val="Compact"/>
+            </w:pPr>
+          </w:p>
+        </w:tc>
+      </w:tr>
+      <w:tr>
+        <w:tc>
+          <w:tcPr/>
+          <w:p>
+            <w:pPr>
+              <w:pStyle w:val="Compact"/>
+            </w:pPr>
+            <w:r>
+              <w:t xml:space="preserve">Time</w:t>
+            </w:r>
+          </w:p>
+        </w:tc>
+        <w:tc>
+          <w:tcPr/>
+          <w:p>
+            <w:pPr>
+              <w:pStyle w:val="Compact"/>
+            </w:pPr>
+          </w:p>
+        </w:tc>
+      </w:tr>
+      <w:tr>
+        <w:tc>
+          <w:tcPr/>
+          <w:p>
+            <w:pPr>
+              <w:pStyle w:val="Compact"/>
+            </w:pPr>
+            <w:r>
+              <w:t xml:space="preserve">Meeting Location</w:t>
+            </w:r>
+          </w:p>
+        </w:tc>
+        <w:tc>
+          <w:tcPr/>
+          <w:p>
+            <w:pPr>
+              <w:pStyle w:val="Compact"/>
+            </w:pPr>
+          </w:p>
+        </w:tc>
+      </w:tr>
+      <w:tr>
+        <w:tc>
+          <w:tcPr/>
+          <w:p>
+            <w:pPr>
+              <w:pStyle w:val="Compact"/>
+            </w:pPr>
+            <w:r>
+              <w:t xml:space="preserve">Notetaker</w:t>
             </w:r>
           </w:p>
         </w:tc>
@@ -1767,38 +2195,72 @@
       </w:tr>
     </w:tbl>
     <w:p>
-      <w:r>
-        <w:pict>
-          <v:rect style="width:0;height:1.5pt" o:hralign="center" o:hrstd="t" o:hr="t"/>
-        </w:pict>
-      </w:r>
-    </w:p>
-    <w:bookmarkEnd w:id="19"/>
-    <w:bookmarkStart w:id="20" w:name="round-2-_______________"/>
-    <w:p>
-      <w:pPr>
-        <w:pStyle w:val="Heading3"/>
-      </w:pPr>
-      <w:r>
-        <w:t xml:space="preserve">Round 2: _______________</w:t>
-      </w:r>
-    </w:p>
-    <w:p>
-      <w:pPr>
-        <w:pStyle w:val="FirstParagraph"/>
+      <w:pPr>
+        <w:pStyle w:val="BlockText"/>
       </w:pPr>
       <w:r>
         <w:rPr>
           <w:b/>
           <w:bCs/>
         </w:rPr>
-        <w:t xml:space="preserve">Roles swap:</w:t>
+        <w:t xml:space="preserve">Reminder:</w:t>
       </w:r>
       <w:r>
         <w:t xml:space="preserve"> </w:t>
       </w:r>
       <w:r>
-        <w:t xml:space="preserve">Partner A = Employer Advocate, Partner B = Employee Advocate</w:t>
+        <w:t xml:space="preserve">Spring Break is coming up. Make sure to note the correct date for the next team meeting.</w:t>
+      </w:r>
+    </w:p>
+    <w:p>
+      <w:r>
+        <w:pict>
+          <v:rect style="width:0;height:1.5pt" o:hralign="center" o:hrstd="t" o:hr="t"/>
+        </w:pict>
+      </w:r>
+    </w:p>
+    <w:bookmarkEnd w:id="23"/>
+    <w:bookmarkStart w:id="24" w:name="Xdffffa9589697c6b137d1a3c94709d5cb808246"/>
+    <w:p>
+      <w:pPr>
+        <w:pStyle w:val="Heading3"/>
+      </w:pPr>
+      <w:r>
+        <w:t xml:space="preserve">[1 minute] Self and Peer Review Evaluation Survey</w:t>
+      </w:r>
+    </w:p>
+    <w:p>
+      <w:pPr>
+        <w:pStyle w:val="FirstParagraph"/>
+      </w:pPr>
+      <w:r>
+        <w:t xml:space="preserve">Conduct a survey for self/peer evaluation. You can find the URL in the syllabus.</w:t>
+      </w:r>
+    </w:p>
+    <w:p>
+      <w:pPr>
+        <w:pStyle w:val="BodyText"/>
+      </w:pPr>
+      <w:r>
+        <w:rPr>
+          <w:b/>
+          <w:bCs/>
+        </w:rPr>
+        <w:t xml:space="preserve">Tip:</w:t>
+      </w:r>
+      <w:r>
+        <w:t xml:space="preserve"> </w:t>
+      </w:r>
+      <w:r>
+        <w:t xml:space="preserve">Bookmark this survey URL on your phone. You will use it every week for team meetings.</w:t>
+      </w:r>
+    </w:p>
+    <w:p>
+      <w:pPr>
+        <w:pStyle w:val="BodyText"/>
+      </w:pPr>
+      <w:r>
+        <w:t xml:space="preserve">Once you finish the survey, you will receive the survey completion code. The Notetaker needs to collect all survey completion codes from team members. The completion code will be used as an attendance check.</w:t>
       </w:r>
     </w:p>
     <w:tbl>
@@ -1830,717 +2292,152 @@
               <w:pStyle w:val="Compact"/>
             </w:pPr>
             <w:r>
-              <w:t xml:space="preserve">Phase</w:t>
-            </w:r>
-          </w:p>
-        </w:tc>
-        <w:tc>
-          <w:tcPr/>
-          <w:p>
-            <w:pPr>
-              <w:pStyle w:val="Compact"/>
-            </w:pPr>
-            <w:r>
-              <w:t xml:space="preserve">Details</w:t>
-            </w:r>
-          </w:p>
-        </w:tc>
-      </w:tr>
-      <w:tr>
-        <w:tc>
-          <w:tcPr/>
-          <w:p>
-            <w:pPr>
-              <w:pStyle w:val="Compact"/>
-            </w:pPr>
-            <w:r>
-              <w:t xml:space="preserve">Partner A persuades B (2 min)</w:t>
-            </w:r>
-          </w:p>
-        </w:tc>
-        <w:tc>
-          <w:tcPr/>
-          <w:p>
-            <w:pPr>
-              <w:pStyle w:val="Compact"/>
-            </w:pPr>
-            <w:r>
-              <w:t xml:space="preserve">Employer side argues to Employee</w:t>
-            </w:r>
-          </w:p>
-        </w:tc>
-      </w:tr>
-      <w:tr>
-        <w:tc>
-          <w:tcPr/>
-          <w:p>
-            <w:pPr>
-              <w:pStyle w:val="Compact"/>
-            </w:pPr>
-            <w:r>
-              <w:t xml:space="preserve">Partner B persuades A (2 min)</w:t>
-            </w:r>
-          </w:p>
-        </w:tc>
-        <w:tc>
-          <w:tcPr/>
-          <w:p>
-            <w:pPr>
-              <w:pStyle w:val="Compact"/>
-            </w:pPr>
-            <w:r>
-              <w:t xml:space="preserve">Employee side argues to Employer</w:t>
-            </w:r>
+              <w:t xml:space="preserve">Name</w:t>
+            </w:r>
+          </w:p>
+        </w:tc>
+        <w:tc>
+          <w:tcPr/>
+          <w:p>
+            <w:pPr>
+              <w:pStyle w:val="Compact"/>
+            </w:pPr>
+            <w:r>
+              <w:t xml:space="preserve">Survey Completion Code</w:t>
+            </w:r>
+          </w:p>
+        </w:tc>
+      </w:tr>
+      <w:tr>
+        <w:tc>
+          <w:tcPr/>
+          <w:p>
+            <w:pPr>
+              <w:pStyle w:val="Compact"/>
+            </w:pPr>
+            <w:r>
+              <w:t xml:space="preserve">1.</w:t>
+            </w:r>
+          </w:p>
+        </w:tc>
+        <w:tc>
+          <w:tcPr/>
+          <w:p>
+            <w:pPr>
+              <w:pStyle w:val="Compact"/>
+            </w:pPr>
+          </w:p>
+        </w:tc>
+      </w:tr>
+      <w:tr>
+        <w:tc>
+          <w:tcPr/>
+          <w:p>
+            <w:pPr>
+              <w:pStyle w:val="Compact"/>
+            </w:pPr>
+            <w:r>
+              <w:t xml:space="preserve">2.</w:t>
+            </w:r>
+          </w:p>
+        </w:tc>
+        <w:tc>
+          <w:tcPr/>
+          <w:p>
+            <w:pPr>
+              <w:pStyle w:val="Compact"/>
+            </w:pPr>
+          </w:p>
+        </w:tc>
+      </w:tr>
+      <w:tr>
+        <w:tc>
+          <w:tcPr/>
+          <w:p>
+            <w:pPr>
+              <w:pStyle w:val="Compact"/>
+            </w:pPr>
+            <w:r>
+              <w:t xml:space="preserve">3.</w:t>
+            </w:r>
+          </w:p>
+        </w:tc>
+        <w:tc>
+          <w:tcPr/>
+          <w:p>
+            <w:pPr>
+              <w:pStyle w:val="Compact"/>
+            </w:pPr>
+          </w:p>
+        </w:tc>
+      </w:tr>
+      <w:tr>
+        <w:tc>
+          <w:tcPr/>
+          <w:p>
+            <w:pPr>
+              <w:pStyle w:val="Compact"/>
+            </w:pPr>
+            <w:r>
+              <w:t xml:space="preserve">4.</w:t>
+            </w:r>
+          </w:p>
+        </w:tc>
+        <w:tc>
+          <w:tcPr/>
+          <w:p>
+            <w:pPr>
+              <w:pStyle w:val="Compact"/>
+            </w:pPr>
+          </w:p>
+        </w:tc>
+      </w:tr>
+      <w:tr>
+        <w:tc>
+          <w:tcPr/>
+          <w:p>
+            <w:pPr>
+              <w:pStyle w:val="Compact"/>
+            </w:pPr>
+            <w:r>
+              <w:t xml:space="preserve">5.</w:t>
+            </w:r>
+          </w:p>
+        </w:tc>
+        <w:tc>
+          <w:tcPr/>
+          <w:p>
+            <w:pPr>
+              <w:pStyle w:val="Compact"/>
+            </w:pPr>
+          </w:p>
+        </w:tc>
+      </w:tr>
+      <w:tr>
+        <w:tc>
+          <w:tcPr/>
+          <w:p>
+            <w:pPr>
+              <w:pStyle w:val="Compact"/>
+            </w:pPr>
+            <w:r>
+              <w:t xml:space="preserve">6.</w:t>
+            </w:r>
+          </w:p>
+        </w:tc>
+        <w:tc>
+          <w:tcPr/>
+          <w:p>
+            <w:pPr>
+              <w:pStyle w:val="Compact"/>
+            </w:pPr>
           </w:p>
         </w:tc>
       </w:tr>
     </w:tbl>
-    <w:p>
-      <w:pPr>
-        <w:pStyle w:val="BodyText"/>
-      </w:pPr>
-      <w:r>
-        <w:rPr>
-          <w:b/>
-          <w:bCs/>
-        </w:rPr>
-        <w:t xml:space="preserve">Debrief (3 min):</w:t>
-      </w:r>
-      <w:r>
-        <w:t xml:space="preserve"> </w:t>
-      </w:r>
-      <w:r>
-        <w:t xml:space="preserve">Each pair shares with the group.</w:t>
-      </w:r>
-    </w:p>
-    <w:tbl>
-      <w:tblPr>
-        <w:tblW w:type="pct" w:w="5000"/>
-        <w:tblStyle w:val="Table"/>
-        <w:tblLook w:firstRow="1" w:lastRow="0" w:firstColumn="0" w:lastColumn="0" w:noHBand="0" w:noVBand="0" w:val="0020"/>
-        <w:tblBorders>
-          <w:top w:val="single" w:sz="4" w:space="0" w:color="000000"/>
-          <w:left w:val="single" w:sz="4" w:space="0" w:color="000000"/>
-          <w:bottom w:val="single" w:sz="4" w:space="0" w:color="000000"/>
-          <w:right w:val="single" w:sz="4" w:space="0" w:color="000000"/>
-          <w:insideH w:val="single" w:sz="4" w:space="0" w:color="000000"/>
-          <w:insideV w:val="single" w:sz="4" w:space="0" w:color="000000"/>
-        </w:tblBorders>
-      </w:tblPr>
-      <w:tblGrid>
-        <w:gridCol w:w="3960"/>
-        <w:gridCol w:w="3960"/>
-      </w:tblGrid>
-      <w:tr>
-        <w:trPr>
-          <w:tblHeader w:val="on"/>
-        </w:trPr>
-        <w:tc>
-          <w:tcPr/>
-          <w:p>
-            <w:pPr>
-              <w:pStyle w:val="Compact"/>
-            </w:pPr>
-            <w:r>
-              <w:t xml:space="preserve">Pair</w:t>
-            </w:r>
-          </w:p>
-        </w:tc>
-        <w:tc>
-          <w:tcPr/>
-          <w:p>
-            <w:pPr>
-              <w:pStyle w:val="Compact"/>
-            </w:pPr>
-            <w:r>
-              <w:t xml:space="preserve">What was the most convincing argument?</w:t>
-            </w:r>
-          </w:p>
-        </w:tc>
-      </w:tr>
-      <w:tr>
-        <w:tc>
-          <w:tcPr/>
-          <w:p>
-            <w:pPr>
-              <w:pStyle w:val="Compact"/>
-            </w:pPr>
-            <w:r>
-              <w:t xml:space="preserve">Pair 1</w:t>
-            </w:r>
-          </w:p>
-        </w:tc>
-        <w:tc>
-          <w:tcPr/>
-          <w:p>
-            <w:pPr>
-              <w:pStyle w:val="Compact"/>
-            </w:pPr>
-          </w:p>
-        </w:tc>
-      </w:tr>
-      <w:tr>
-        <w:tc>
-          <w:tcPr/>
-          <w:p>
-            <w:pPr>
-              <w:pStyle w:val="Compact"/>
-            </w:pPr>
-            <w:r>
-              <w:t xml:space="preserve">Pair 2</w:t>
-            </w:r>
-          </w:p>
-        </w:tc>
-        <w:tc>
-          <w:tcPr/>
-          <w:p>
-            <w:pPr>
-              <w:pStyle w:val="Compact"/>
-            </w:pPr>
-          </w:p>
-        </w:tc>
-      </w:tr>
-      <w:tr>
-        <w:tc>
-          <w:tcPr/>
-          <w:p>
-            <w:pPr>
-              <w:pStyle w:val="Compact"/>
-            </w:pPr>
-            <w:r>
-              <w:t xml:space="preserve">Pair 3</w:t>
-            </w:r>
-          </w:p>
-        </w:tc>
-        <w:tc>
-          <w:tcPr/>
-          <w:p>
-            <w:pPr>
-              <w:pStyle w:val="Compact"/>
-            </w:pPr>
-          </w:p>
-        </w:tc>
-      </w:tr>
-    </w:tbl>
-    <w:p>
-      <w:r>
-        <w:pict>
-          <v:rect style="width:0;height:1.5pt" o:hralign="center" o:hrstd="t" o:hr="t"/>
-        </w:pict>
-      </w:r>
-    </w:p>
-    <w:bookmarkEnd w:id="20"/>
-    <w:bookmarkStart w:id="21" w:name="minutes-final-reflection"/>
-    <w:p>
-      <w:pPr>
-        <w:pStyle w:val="Heading3"/>
-      </w:pPr>
-      <w:r>
-        <w:t xml:space="preserve">[6 minutes] Final Reflection</w:t>
-      </w:r>
-    </w:p>
-    <w:tbl>
-      <w:tblPr>
-        <w:tblW w:type="pct" w:w="5000"/>
-        <w:tblStyle w:val="Table"/>
-        <w:tblLook w:firstRow="1" w:lastRow="0" w:firstColumn="0" w:lastColumn="0" w:noHBand="0" w:noVBand="0" w:val="0020"/>
-        <w:tblBorders>
-          <w:top w:val="single" w:sz="4" w:space="0" w:color="000000"/>
-          <w:left w:val="single" w:sz="4" w:space="0" w:color="000000"/>
-          <w:bottom w:val="single" w:sz="4" w:space="0" w:color="000000"/>
-          <w:right w:val="single" w:sz="4" w:space="0" w:color="000000"/>
-          <w:insideH w:val="single" w:sz="4" w:space="0" w:color="000000"/>
-          <w:insideV w:val="single" w:sz="4" w:space="0" w:color="000000"/>
-        </w:tblBorders>
-      </w:tblPr>
-      <w:tblGrid>
-        <w:gridCol w:w="3960"/>
-        <w:gridCol w:w="3960"/>
-      </w:tblGrid>
-      <w:tr>
-        <w:trPr>
-          <w:tblHeader w:val="on"/>
-        </w:trPr>
-        <w:tc>
-          <w:tcPr/>
-          <w:p>
-            <w:pPr>
-              <w:pStyle w:val="Compact"/>
-            </w:pPr>
-            <w:r>
-              <w:t xml:space="preserve">Question</w:t>
-            </w:r>
-          </w:p>
-        </w:tc>
-        <w:tc>
-          <w:tcPr/>
-          <w:p>
-            <w:pPr>
-              <w:pStyle w:val="Compact"/>
-            </w:pPr>
-            <w:r>
-              <w:t xml:space="preserve">Notes</w:t>
-            </w:r>
-          </w:p>
-        </w:tc>
-      </w:tr>
-      <w:tr>
-        <w:tc>
-          <w:tcPr/>
-          <w:p>
-            <w:pPr>
-              <w:pStyle w:val="Compact"/>
-            </w:pPr>
-            <w:r>
-              <w:t xml:space="preserve">Which topic was harder to argue? Why?</w:t>
-            </w:r>
-          </w:p>
-        </w:tc>
-        <w:tc>
-          <w:tcPr/>
-          <w:p>
-            <w:pPr>
-              <w:pStyle w:val="Compact"/>
-            </w:pPr>
-          </w:p>
-        </w:tc>
-      </w:tr>
-      <w:tr>
-        <w:tc>
-          <w:tcPr/>
-          <w:p>
-            <w:pPr>
-              <w:pStyle w:val="Compact"/>
-            </w:pPr>
-            <w:r>
-              <w:t xml:space="preserve">Did your opinion change after hearing the other side?</w:t>
-            </w:r>
-          </w:p>
-        </w:tc>
-        <w:tc>
-          <w:tcPr/>
-          <w:p>
-            <w:pPr>
-              <w:pStyle w:val="Compact"/>
-            </w:pPr>
-          </w:p>
-        </w:tc>
-      </w:tr>
-      <w:tr>
-        <w:tc>
-          <w:tcPr/>
-          <w:p>
-            <w:pPr>
-              <w:pStyle w:val="Compact"/>
-            </w:pPr>
-            <w:r>
-              <w:t xml:space="preserve">What was the single most persuasive point you heard today?</w:t>
-            </w:r>
-          </w:p>
-        </w:tc>
-        <w:tc>
-          <w:tcPr/>
-          <w:p>
-            <w:pPr>
-              <w:pStyle w:val="Compact"/>
-            </w:pPr>
-          </w:p>
-        </w:tc>
-      </w:tr>
-    </w:tbl>
-    <w:p>
-      <w:r>
-        <w:pict>
-          <v:rect style="width:0;height:1.5pt" o:hralign="center" o:hrstd="t" o:hr="t"/>
-        </w:pict>
-      </w:r>
-    </w:p>
-    <w:bookmarkEnd w:id="21"/>
-    <w:bookmarkStart w:id="22" w:name="minute-wrap-up"/>
-    <w:p>
-      <w:pPr>
-        <w:pStyle w:val="Heading3"/>
-      </w:pPr>
-      <w:r>
-        <w:t xml:space="preserve">[1 minute] Wrap-up</w:t>
-      </w:r>
-    </w:p>
-    <w:p>
-      <w:pPr>
-        <w:pStyle w:val="FirstParagraph"/>
-      </w:pPr>
-      <w:r>
-        <w:t xml:space="preserve">Check the syllabus to find out when the next team meeting will be. Discuss who will be the next Notetaker.</w:t>
-      </w:r>
-    </w:p>
-    <w:p>
-      <w:pPr>
-        <w:pStyle w:val="BodyText"/>
-      </w:pPr>
-      <w:r>
-        <w:rPr>
-          <w:b/>
-          <w:bCs/>
-        </w:rPr>
-        <w:t xml:space="preserve">Our next meeting:</w:t>
-      </w:r>
-    </w:p>
-    <w:tbl>
-      <w:tblPr>
-        <w:tblW w:type="pct" w:w="5000"/>
-        <w:tblStyle w:val="Table"/>
-        <w:tblLook w:firstRow="1" w:lastRow="0" w:firstColumn="0" w:lastColumn="0" w:noHBand="0" w:noVBand="0" w:val="0020"/>
-        <w:tblBorders>
-          <w:top w:val="single" w:sz="4" w:space="0" w:color="000000"/>
-          <w:left w:val="single" w:sz="4" w:space="0" w:color="000000"/>
-          <w:bottom w:val="single" w:sz="4" w:space="0" w:color="000000"/>
-          <w:right w:val="single" w:sz="4" w:space="0" w:color="000000"/>
-          <w:insideH w:val="single" w:sz="4" w:space="0" w:color="000000"/>
-          <w:insideV w:val="single" w:sz="4" w:space="0" w:color="000000"/>
-        </w:tblBorders>
-      </w:tblPr>
-      <w:tblGrid>
-        <w:gridCol w:w="3960"/>
-        <w:gridCol w:w="3960"/>
-      </w:tblGrid>
-      <w:tr>
-        <w:trPr>
-          <w:tblHeader w:val="on"/>
-        </w:trPr>
-        <w:tc>
-          <w:tcPr/>
-          <w:p>
-            <w:pPr>
-              <w:pStyle w:val="Compact"/>
-            </w:pPr>
-            <w:r>
-              <w:t xml:space="preserve">Item</w:t>
-            </w:r>
-          </w:p>
-        </w:tc>
-        <w:tc>
-          <w:tcPr/>
-          <w:p>
-            <w:pPr>
-              <w:pStyle w:val="Compact"/>
-            </w:pPr>
-            <w:r>
-              <w:t xml:space="preserve">Details</w:t>
-            </w:r>
-          </w:p>
-        </w:tc>
-      </w:tr>
-      <w:tr>
-        <w:tc>
-          <w:tcPr/>
-          <w:p>
-            <w:pPr>
-              <w:pStyle w:val="Compact"/>
-            </w:pPr>
-            <w:r>
-              <w:t xml:space="preserve">Date</w:t>
-            </w:r>
-          </w:p>
-        </w:tc>
-        <w:tc>
-          <w:tcPr/>
-          <w:p>
-            <w:pPr>
-              <w:pStyle w:val="Compact"/>
-            </w:pPr>
-          </w:p>
-        </w:tc>
-      </w:tr>
-      <w:tr>
-        <w:tc>
-          <w:tcPr/>
-          <w:p>
-            <w:pPr>
-              <w:pStyle w:val="Compact"/>
-            </w:pPr>
-            <w:r>
-              <w:t xml:space="preserve">Time</w:t>
-            </w:r>
-          </w:p>
-        </w:tc>
-        <w:tc>
-          <w:tcPr/>
-          <w:p>
-            <w:pPr>
-              <w:pStyle w:val="Compact"/>
-            </w:pPr>
-          </w:p>
-        </w:tc>
-      </w:tr>
-      <w:tr>
-        <w:tc>
-          <w:tcPr/>
-          <w:p>
-            <w:pPr>
-              <w:pStyle w:val="Compact"/>
-            </w:pPr>
-            <w:r>
-              <w:t xml:space="preserve">Meeting Location</w:t>
-            </w:r>
-          </w:p>
-        </w:tc>
-        <w:tc>
-          <w:tcPr/>
-          <w:p>
-            <w:pPr>
-              <w:pStyle w:val="Compact"/>
-            </w:pPr>
-          </w:p>
-        </w:tc>
-      </w:tr>
-      <w:tr>
-        <w:tc>
-          <w:tcPr/>
-          <w:p>
-            <w:pPr>
-              <w:pStyle w:val="Compact"/>
-            </w:pPr>
-            <w:r>
-              <w:t xml:space="preserve">Notetaker</w:t>
-            </w:r>
-          </w:p>
-        </w:tc>
-        <w:tc>
-          <w:tcPr/>
-          <w:p>
-            <w:pPr>
-              <w:pStyle w:val="Compact"/>
-            </w:pPr>
-          </w:p>
-        </w:tc>
-      </w:tr>
-    </w:tbl>
-    <w:p>
-      <w:r>
-        <w:pict>
-          <v:rect style="width:0;height:1.5pt" o:hralign="center" o:hrstd="t" o:hr="t"/>
-        </w:pict>
-      </w:r>
-    </w:p>
-    <w:bookmarkEnd w:id="22"/>
-    <w:bookmarkStart w:id="23" w:name="Xdffffa9589697c6b137d1a3c94709d5cb808246"/>
-    <w:p>
-      <w:pPr>
-        <w:pStyle w:val="Heading3"/>
-      </w:pPr>
-      <w:r>
-        <w:t xml:space="preserve">[1 minute] Self and Peer Review Evaluation Survey</w:t>
-      </w:r>
-    </w:p>
-    <w:p>
-      <w:pPr>
-        <w:pStyle w:val="FirstParagraph"/>
-      </w:pPr>
-      <w:r>
-        <w:t xml:space="preserve">Conduct a survey for self/peer evaluation. You can find the URL in the syllabus.</w:t>
-      </w:r>
-    </w:p>
-    <w:p>
-      <w:pPr>
-        <w:pStyle w:val="BodyText"/>
-      </w:pPr>
-      <w:r>
-        <w:rPr>
-          <w:b/>
-          <w:bCs/>
-        </w:rPr>
-        <w:t xml:space="preserve">Tip:</w:t>
-      </w:r>
-      <w:r>
-        <w:t xml:space="preserve"> </w:t>
-      </w:r>
-      <w:r>
-        <w:t xml:space="preserve">Bookmark this survey URL on your phone. You will use it every week for team meetings.</w:t>
-      </w:r>
-    </w:p>
-    <w:p>
-      <w:pPr>
-        <w:pStyle w:val="BodyText"/>
-      </w:pPr>
-      <w:r>
-        <w:t xml:space="preserve">Once you finish the survey, you will receive the survey completion code. The Notetaker needs to collect all survey completion codes from team members. The completion code will be used as an attendance check.</w:t>
-      </w:r>
-    </w:p>
-    <w:tbl>
-      <w:tblPr>
-        <w:tblW w:type="pct" w:w="5000"/>
-        <w:tblStyle w:val="Table"/>
-        <w:tblLook w:firstRow="1" w:lastRow="0" w:firstColumn="0" w:lastColumn="0" w:noHBand="0" w:noVBand="0" w:val="0020"/>
-        <w:tblBorders>
-          <w:top w:val="single" w:sz="4" w:space="0" w:color="000000"/>
-          <w:left w:val="single" w:sz="4" w:space="0" w:color="000000"/>
-          <w:bottom w:val="single" w:sz="4" w:space="0" w:color="000000"/>
-          <w:right w:val="single" w:sz="4" w:space="0" w:color="000000"/>
-          <w:insideH w:val="single" w:sz="4" w:space="0" w:color="000000"/>
-          <w:insideV w:val="single" w:sz="4" w:space="0" w:color="000000"/>
-        </w:tblBorders>
-      </w:tblPr>
-      <w:tblGrid>
-        <w:gridCol w:w="3960"/>
-        <w:gridCol w:w="3960"/>
-      </w:tblGrid>
-      <w:tr>
-        <w:trPr>
-          <w:tblHeader w:val="on"/>
-        </w:trPr>
-        <w:tc>
-          <w:tcPr/>
-          <w:p>
-            <w:pPr>
-              <w:pStyle w:val="Compact"/>
-            </w:pPr>
-            <w:r>
-              <w:t xml:space="preserve">Name</w:t>
-            </w:r>
-          </w:p>
-        </w:tc>
-        <w:tc>
-          <w:tcPr/>
-          <w:p>
-            <w:pPr>
-              <w:pStyle w:val="Compact"/>
-            </w:pPr>
-            <w:r>
-              <w:t xml:space="preserve">Survey Completion Code</w:t>
-            </w:r>
-          </w:p>
-        </w:tc>
-      </w:tr>
-      <w:tr>
-        <w:tc>
-          <w:tcPr/>
-          <w:p>
-            <w:pPr>
-              <w:pStyle w:val="Compact"/>
-            </w:pPr>
-            <w:r>
-              <w:t xml:space="preserve">1.</w:t>
-            </w:r>
-          </w:p>
-        </w:tc>
-        <w:tc>
-          <w:tcPr/>
-          <w:p>
-            <w:pPr>
-              <w:pStyle w:val="Compact"/>
-            </w:pPr>
-          </w:p>
-        </w:tc>
-      </w:tr>
-      <w:tr>
-        <w:tc>
-          <w:tcPr/>
-          <w:p>
-            <w:pPr>
-              <w:pStyle w:val="Compact"/>
-            </w:pPr>
-            <w:r>
-              <w:t xml:space="preserve">2.</w:t>
-            </w:r>
-          </w:p>
-        </w:tc>
-        <w:tc>
-          <w:tcPr/>
-          <w:p>
-            <w:pPr>
-              <w:pStyle w:val="Compact"/>
-            </w:pPr>
-          </w:p>
-        </w:tc>
-      </w:tr>
-      <w:tr>
-        <w:tc>
-          <w:tcPr/>
-          <w:p>
-            <w:pPr>
-              <w:pStyle w:val="Compact"/>
-            </w:pPr>
-            <w:r>
-              <w:t xml:space="preserve">3.</w:t>
-            </w:r>
-          </w:p>
-        </w:tc>
-        <w:tc>
-          <w:tcPr/>
-          <w:p>
-            <w:pPr>
-              <w:pStyle w:val="Compact"/>
-            </w:pPr>
-          </w:p>
-        </w:tc>
-      </w:tr>
-      <w:tr>
-        <w:tc>
-          <w:tcPr/>
-          <w:p>
-            <w:pPr>
-              <w:pStyle w:val="Compact"/>
-            </w:pPr>
-            <w:r>
-              <w:t xml:space="preserve">4.</w:t>
-            </w:r>
-          </w:p>
-        </w:tc>
-        <w:tc>
-          <w:tcPr/>
-          <w:p>
-            <w:pPr>
-              <w:pStyle w:val="Compact"/>
-            </w:pPr>
-          </w:p>
-        </w:tc>
-      </w:tr>
-      <w:tr>
-        <w:tc>
-          <w:tcPr/>
-          <w:p>
-            <w:pPr>
-              <w:pStyle w:val="Compact"/>
-            </w:pPr>
-            <w:r>
-              <w:t xml:space="preserve">5.</w:t>
-            </w:r>
-          </w:p>
-        </w:tc>
-        <w:tc>
-          <w:tcPr/>
-          <w:p>
-            <w:pPr>
-              <w:pStyle w:val="Compact"/>
-            </w:pPr>
-          </w:p>
-        </w:tc>
-      </w:tr>
-      <w:tr>
-        <w:tc>
-          <w:tcPr/>
-          <w:p>
-            <w:pPr>
-              <w:pStyle w:val="Compact"/>
-            </w:pPr>
-            <w:r>
-              <w:t xml:space="preserve">6.</w:t>
-            </w:r>
-          </w:p>
-        </w:tc>
-        <w:tc>
-          <w:tcPr/>
-          <w:p>
-            <w:pPr>
-              <w:pStyle w:val="Compact"/>
-            </w:pPr>
-          </w:p>
-        </w:tc>
-      </w:tr>
-    </w:tbl>
-    <w:bookmarkEnd w:id="23"/>
     <w:bookmarkEnd w:id="24"/>
     <w:bookmarkEnd w:id="25"/>
+    <w:bookmarkEnd w:id="26"/>
     <w:sectPr>
       <w:footnotePr>
         <w:numRestart w:val="eachSect"/>

</xml_diff>